<commit_message>
Update constants in separate files
</commit_message>
<xml_diff>
--- a/src/templates/docx/template_id.docx
+++ b/src/templates/docx/template_id.docx
@@ -247,15 +247,6 @@
                 <w:sz w:val="20"/>
                 <w:szCs w:val="20"/>
               </w:rPr>
-              <w:t>1</w:t>
-            </w:r>
-            <w:r>
-              <w:rPr>
-                <w:rFonts w:ascii="Calibri" w:eastAsia="Times New Roman" w:hAnsi="Calibri" w:cs="Calibri"/>
-                <w:color w:val="000000"/>
-                <w:sz w:val="20"/>
-                <w:szCs w:val="20"/>
-              </w:rPr>
               <w:t>}}</w:t>
             </w:r>
           </w:p>
@@ -694,17 +685,7 @@
                 <w:sz w:val="20"/>
                 <w:szCs w:val="20"/>
               </w:rPr>
-              <w:t>{{</w:t>
-            </w:r>
-            <w:proofErr w:type="spellStart"/>
-            <w:r>
-              <w:rPr>
-                <w:rFonts w:ascii="Calibri" w:eastAsia="Times New Roman" w:hAnsi="Calibri" w:cs="Calibri"/>
-                <w:color w:val="000000"/>
-                <w:sz w:val="20"/>
-                <w:szCs w:val="20"/>
-              </w:rPr>
-              <w:t>PAN</w:t>
+              <w:t>{{PAN</w:t>
             </w:r>
             <w:r>
               <w:rPr>
@@ -715,7 +696,6 @@
               </w:rPr>
               <w:t>_number</w:t>
             </w:r>
-            <w:proofErr w:type="spellEnd"/>
             <w:r>
               <w:rPr>
                 <w:rFonts w:ascii="Calibri" w:eastAsia="Times New Roman" w:hAnsi="Calibri" w:cs="Calibri"/>

</xml_diff>